<commit_message>
fix: chong cache API va client de luon cap nhat tuan 7 va 8 moi nhat
</commit_message>
<xml_diff>
--- a/public/data/TUAN 5/DE_THI/de_thi_hsg_lam_dong_1_2_(5).docx
+++ b/public/data/TUAN 5/DE_THI/de_thi_hsg_lam_dong_1_2_(5).docx
@@ -766,213 +766,21 @@
       </w:r>
     </w:p>
     <w:p>
-      <w:r>
-        <w:br w:type="page"/>
-      </w:r>
-    </w:p>
-    <w:p>
       <w:pPr>
         <w:jc w:val="center"/>
       </w:pPr>
       <w:r>
         <w:rPr>
           <w:b/>
-          <w:color w:val="003366"/>
-          <w:sz w:val="28"/>
         </w:rPr>
-        <w:t>HƯỚNG DẪN CHẤM VÀ MÃ NGUỒN MẪU PYTHON</w:t>
+        <w:t>------------------ HẾT ------------------</w:t>
         <w:br/>
-        <w:t>(Dành cho Giáo viên chấm thi)</w:t>
       </w:r>
-    </w:p>
-    <w:p>
-      <w:pPr>
-        <w:jc w:val="center"/>
-      </w:pPr>
-      <w:r>
-        <w:t>──────────────────────────────────────────────────</w:t>
-      </w:r>
-    </w:p>
-    <w:p>
       <w:r>
         <w:rPr>
-          <w:b/>
-          <w:color w:val="003366"/>
-          <w:sz w:val="24"/>
+          <w:i/>
         </w:rPr>
-        <w:t>1. Hướng dẫn giải Bài 1 (HOANHAO.PY):</w:t>
-      </w:r>
-    </w:p>
-    <w:p>
-      <w:r>
-        <w:t>- Thuật toán: Duyệt xâu S, bóc tách các ký tự số liên tiếp để gom thành một số nguyên.</w:t>
-      </w:r>
-    </w:p>
-    <w:p>
-      <w:r>
-        <w:t>- Viết hàm is_perfect(n) kiểm tra số hoàn hảo tối ưu O(sqrt(n)): Tính tổng tất cả các ước thực sự của n.</w:t>
-      </w:r>
-    </w:p>
-    <w:p>
-      <w:r>
-        <w:t>- Cú pháp mã nguồn Python tối ưu:</w:t>
-      </w:r>
-    </w:p>
-    <w:p>
-      <w:r>
-        <w:rPr>
-          <w:rFonts w:ascii="Courier New" w:hAnsi="Courier New"/>
-          <w:sz w:val="20"/>
-        </w:rPr>
-        <w:t>import math</w:t>
-        <w:br/>
-        <w:br/>
-        <w:t>def is_perfect(n):</w:t>
-        <w:br/>
-        <w:t xml:space="preserve">    if n &lt;= 1:</w:t>
-        <w:br/>
-        <w:t xml:space="preserve">        return False</w:t>
-        <w:br/>
-        <w:t xml:space="preserve">    sum_div = 1</w:t>
-        <w:br/>
-        <w:t xml:space="preserve">    sqrt_n = math.isqrt(n)</w:t>
-        <w:br/>
-        <w:t xml:space="preserve">    for i in range(2, sqrt_n + 1):</w:t>
-        <w:br/>
-        <w:t xml:space="preserve">        if n % i == 0:</w:t>
-        <w:br/>
-        <w:t xml:space="preserve">            sum_div += i</w:t>
-        <w:br/>
-        <w:t xml:space="preserve">            if i * i != n:</w:t>
-        <w:br/>
-        <w:t xml:space="preserve">                sum_div += n // i</w:t>
-        <w:br/>
-        <w:t xml:space="preserve">    return sum_div == n</w:t>
-        <w:br/>
-        <w:br/>
-        <w:t>with open("HOANHAO.INP", "r", encoding="utf-8") as f:</w:t>
-        <w:br/>
-        <w:t xml:space="preserve">    s = f.read().strip()</w:t>
-        <w:br/>
-        <w:br/>
-        <w:t>temp = ""</w:t>
-        <w:br/>
-        <w:t>numbers = []</w:t>
-        <w:br/>
-        <w:t>for char in s:</w:t>
-        <w:br/>
-        <w:t xml:space="preserve">    if char.isdigit():</w:t>
-        <w:br/>
-        <w:t xml:space="preserve">        temp += char</w:t>
-        <w:br/>
-        <w:t xml:space="preserve">    else:</w:t>
-        <w:br/>
-        <w:t xml:space="preserve">        if temp != "":</w:t>
-        <w:br/>
-        <w:t xml:space="preserve">            numbers.append(int(temp))</w:t>
-        <w:br/>
-        <w:t xml:space="preserve">            temp = ""</w:t>
-        <w:br/>
-        <w:t>if temp != "":</w:t>
-        <w:br/>
-        <w:t xml:space="preserve">    numbers.append(int(temp))</w:t>
-        <w:br/>
-        <w:br/>
-        <w:t>perfects = [x for x in numbers if is_perfect(x)]</w:t>
-        <w:br/>
-        <w:br/>
-        <w:t>with open("HOANHAO.OUT", "w", encoding="utf-8") as f:</w:t>
-        <w:br/>
-        <w:t xml:space="preserve">    if not perfects:</w:t>
-        <w:br/>
-        <w:t xml:space="preserve">        f.write("-1\n")</w:t>
-        <w:br/>
-        <w:t xml:space="preserve">    else:</w:t>
-        <w:br/>
-        <w:t xml:space="preserve">        f.write(f"{len(perfects)}\n")</w:t>
-        <w:br/>
-        <w:t xml:space="preserve">        f.write(" ".join(map(str, perfects)) + "\n")</w:t>
-      </w:r>
-    </w:p>
-    <w:p>
-      <w:r>
-        <w:rPr>
-          <w:b/>
-          <w:color w:val="003366"/>
-          <w:sz w:val="24"/>
-        </w:rPr>
-        <w:t>2. Hướng dẫn giải Bài 2 (MUAHOA.PY):</w:t>
-      </w:r>
-    </w:p>
-    <w:p>
-      <w:r>
-        <w:t>- Thuật toán Tham lam (Greedy): Để mua được nhiều chậu hoa nhất, luôn ưu tiên chọn mua các chậu hoa có giá tiền rẻ nhất trước.</w:t>
-      </w:r>
-    </w:p>
-    <w:p>
-      <w:r>
-        <w:t>- Bước 1: Sắp xếp mảng giá hoa A tăng dần bằng thuật toán sort() O(N log N).</w:t>
-      </w:r>
-    </w:p>
-    <w:p>
-      <w:r>
-        <w:t>- Bước 2: Duyệt từng giá chậu hoa, nếu tổng tiền mua không vượt quá M thì cộng dồn chi phí và tăng biến đếm. Khi vượt quá M thì dừng lại.</w:t>
-      </w:r>
-    </w:p>
-    <w:p>
-      <w:r>
-        <w:t>- Cú pháp mã nguồn Python tối ưu:</w:t>
-      </w:r>
-    </w:p>
-    <w:p>
-      <w:r>
-        <w:rPr>
-          <w:rFonts w:ascii="Courier New" w:hAnsi="Courier New"/>
-          <w:sz w:val="20"/>
-        </w:rPr>
-        <w:t>with open("MUAHOA.INP", "r", encoding="utf-8") as f:</w:t>
-        <w:br/>
-        <w:t xml:space="preserve">    lines = f.read().split()</w:t>
-        <w:br/>
-        <w:br/>
-        <w:t>if lines:</w:t>
-        <w:br/>
-        <w:t xml:space="preserve">    n = int(lines[0])</w:t>
-        <w:br/>
-        <w:t xml:space="preserve">    m = int(lines[1])</w:t>
-        <w:br/>
-        <w:t xml:space="preserve">    a = [int(x) for x in lines[2:]]</w:t>
-        <w:br/>
-        <w:br/>
-        <w:t xml:space="preserve">    # Chiến thuật tham lam: Sắp xếp giá tiền tăng dần</w:t>
-        <w:br/>
-        <w:t xml:space="preserve">    a.sort()</w:t>
-        <w:br/>
-        <w:br/>
-        <w:t xml:space="preserve">    count = 0</w:t>
-        <w:br/>
-        <w:t xml:space="preserve">    total_cost = 0</w:t>
-        <w:br/>
-        <w:br/>
-        <w:t xml:space="preserve">    for price in a:</w:t>
-        <w:br/>
-        <w:t xml:space="preserve">        if total_cost + price &lt;= m:</w:t>
-        <w:br/>
-        <w:t xml:space="preserve">            total_cost += price</w:t>
-        <w:br/>
-        <w:t xml:space="preserve">            count += 1</w:t>
-        <w:br/>
-        <w:t xml:space="preserve">        else:</w:t>
-        <w:br/>
-        <w:t xml:space="preserve">            break</w:t>
-        <w:br/>
-        <w:br/>
-        <w:t xml:space="preserve">    money_left = m - total_cost</w:t>
-        <w:br/>
-        <w:br/>
-        <w:t xml:space="preserve">    with open("MUAHOA.OUT", "w", encoding="utf-8") as f:</w:t>
-        <w:br/>
-        <w:t xml:space="preserve">        f.write(f"{count} {money_left}\n")</w:t>
+        <w:t>(Cán bộ coi thi không giải thích gì thêm)</w:t>
       </w:r>
     </w:p>
     <w:sectPr>

</xml_diff>